<commit_message>
gitAuto manual push @ 2026-06-03 16:47:33
</commit_message>
<xml_diff>
--- a/docs/Report/网络管理与运维实验3 网络工程2301班-雷若奇-23053020134.docx
+++ b/docs/Report/网络管理与运维实验3 网络工程2301班-雷若奇-23053020134.docx
@@ -384,11 +384,12 @@
         </w:rPr>
         <w:br w:type="textWrapping"/>
       </w:r>
+      <w:bookmarkStart w:id="0" w:name="_GoBack"/>
       <w:r>
         <w:drawing>
           <wp:inline distT="0" distB="0" distL="114300" distR="114300">
-            <wp:extent cx="5266690" cy="2957195"/>
-            <wp:effectExtent l="0" t="0" r="10160" b="14605"/>
+            <wp:extent cx="5266690" cy="2956560"/>
+            <wp:effectExtent l="0" t="0" r="10160" b="15240"/>
             <wp:docPr id="1" name="图片 1"/>
             <wp:cNvGraphicFramePr>
               <a:graphicFrameLocks xmlns:a="http://schemas.openxmlformats.org/drawingml/2006/main" noChangeAspect="1"/>
@@ -411,7 +412,7 @@
                   <pic:spPr>
                     <a:xfrm>
                       <a:off x="0" y="0"/>
-                      <a:ext cx="5266690" cy="2957195"/>
+                      <a:ext cx="5266690" cy="2956560"/>
                     </a:xfrm>
                     <a:prstGeom prst="rect">
                       <a:avLst/>
@@ -427,6 +428,7 @@
           </wp:inline>
         </w:drawing>
       </w:r>
+      <w:bookmarkEnd w:id="0"/>
     </w:p>
     <w:p>
       <w:pPr>
@@ -474,15 +476,17 @@
     <w:p>
       <w:pPr>
         <w:rPr>
-          <w:sz w:val="24"/>
-          <w:szCs w:val="24"/>
+          <w:rFonts w:hint="eastAsia" w:eastAsiaTheme="minorEastAsia"/>
+          <w:sz w:val="24"/>
+          <w:szCs w:val="24"/>
+          <w:lang w:eastAsia="zh-CN"/>
         </w:rPr>
       </w:pPr>
       <w:r>
         <w:drawing>
           <wp:inline distT="0" distB="0" distL="114300" distR="114300">
-            <wp:extent cx="5266690" cy="2957195"/>
-            <wp:effectExtent l="0" t="0" r="10160" b="14605"/>
+            <wp:extent cx="5266690" cy="2956560"/>
+            <wp:effectExtent l="0" t="0" r="10160" b="15240"/>
             <wp:docPr id="2" name="图片 2"/>
             <wp:cNvGraphicFramePr>
               <a:graphicFrameLocks xmlns:a="http://schemas.openxmlformats.org/drawingml/2006/main" noChangeAspect="1"/>
@@ -505,7 +509,7 @@
                   <pic:spPr>
                     <a:xfrm>
                       <a:off x="0" y="0"/>
-                      <a:ext cx="5266690" cy="2957195"/>
+                      <a:ext cx="5266690" cy="2956560"/>
                     </a:xfrm>
                     <a:prstGeom prst="rect">
                       <a:avLst/>
@@ -524,8 +528,6 @@
       <w:r>
         <w:br w:type="textWrapping"/>
       </w:r>
-      <w:bookmarkStart w:id="0" w:name="_GoBack"/>
-      <w:bookmarkEnd w:id="0"/>
     </w:p>
     <w:p>
       <w:pPr>
@@ -541,152 +543,429 @@
           <w:sz w:val="24"/>
           <w:szCs w:val="24"/>
         </w:rPr>
-        <w:t>3.</w:t>
+        <w:t>4.2</w:t>
+      </w:r>
+      <w:r>
+        <w:rPr>
+          <w:rFonts w:hint="eastAsia"/>
+          <w:sz w:val="24"/>
+          <w:szCs w:val="24"/>
+          <w:lang w:val="en-US" w:eastAsia="zh-CN"/>
+        </w:rPr>
+        <w:t xml:space="preserve"> </w:t>
+      </w:r>
+      <w:r>
+        <w:rPr>
+          <w:rFonts w:hint="eastAsia"/>
+          <w:sz w:val="24"/>
+          <w:szCs w:val="24"/>
+        </w:rPr>
+        <w:t>PacketMonitor</w:t>
       </w:r>
     </w:p>
     <w:p>
       <w:pPr>
         <w:rPr>
-          <w:rFonts w:hint="eastAsia"/>
-          <w:sz w:val="24"/>
-          <w:szCs w:val="24"/>
-        </w:rPr>
-      </w:pPr>
+          <w:rFonts w:hint="default" w:eastAsiaTheme="minorEastAsia"/>
+          <w:sz w:val="24"/>
+          <w:szCs w:val="24"/>
+          <w:lang w:val="en-US" w:eastAsia="zh-CN"/>
+        </w:rPr>
+      </w:pPr>
+      <w:r>
+        <w:rPr>
+          <w:rFonts w:hint="eastAsia"/>
+          <w:sz w:val="24"/>
+          <w:szCs w:val="24"/>
+        </w:rPr>
+        <w:t>1.</w:t>
+      </w:r>
+      <w:r>
+        <w:rPr>
+          <w:rFonts w:hint="eastAsia"/>
+          <w:sz w:val="24"/>
+          <w:szCs w:val="24"/>
+          <w:lang w:val="en-US" w:eastAsia="zh-CN"/>
+        </w:rPr>
+        <w:t xml:space="preserve"> 修改代码</w:t>
+      </w:r>
+      <w:r>
+        <w:rPr>
+          <w:rFonts w:hint="eastAsia"/>
+          <w:sz w:val="24"/>
+          <w:szCs w:val="24"/>
+          <w:lang w:val="en-US" w:eastAsia="zh-CN"/>
+        </w:rPr>
+        <w:br w:type="textWrapping"/>
+      </w:r>
+      <w:r>
+        <w:rPr>
+          <w:rFonts w:hint="default" w:eastAsiaTheme="minorEastAsia"/>
+          <w:sz w:val="24"/>
+          <w:szCs w:val="24"/>
+          <w:lang w:val="en-US" w:eastAsia="zh-CN"/>
+        </w:rPr>
+        <w:drawing>
+          <wp:inline distT="0" distB="0" distL="114300" distR="114300">
+            <wp:extent cx="5266690" cy="2962275"/>
+            <wp:effectExtent l="0" t="0" r="10160" b="9525"/>
+            <wp:docPr id="3" name="图片 3" descr="a3f0125cfdb97374a6898f4864308432"/>
+            <wp:cNvGraphicFramePr>
+              <a:graphicFrameLocks xmlns:a="http://schemas.openxmlformats.org/drawingml/2006/main" noChangeAspect="1"/>
+            </wp:cNvGraphicFramePr>
+            <a:graphic xmlns:a="http://schemas.openxmlformats.org/drawingml/2006/main">
+              <a:graphicData uri="http://schemas.openxmlformats.org/drawingml/2006/picture">
+                <pic:pic xmlns:pic="http://schemas.openxmlformats.org/drawingml/2006/picture">
+                  <pic:nvPicPr>
+                    <pic:cNvPr id="3" name="图片 3" descr="a3f0125cfdb97374a6898f4864308432"/>
+                    <pic:cNvPicPr>
+                      <a:picLocks noChangeAspect="1"/>
+                    </pic:cNvPicPr>
+                  </pic:nvPicPr>
+                  <pic:blipFill>
+                    <a:blip r:embed="rId6"/>
+                    <a:stretch>
+                      <a:fillRect/>
+                    </a:stretch>
+                  </pic:blipFill>
+                  <pic:spPr>
+                    <a:xfrm>
+                      <a:off x="0" y="0"/>
+                      <a:ext cx="5266690" cy="2962275"/>
+                    </a:xfrm>
+                    <a:prstGeom prst="rect">
+                      <a:avLst/>
+                    </a:prstGeom>
+                  </pic:spPr>
+                </pic:pic>
+              </a:graphicData>
+            </a:graphic>
+          </wp:inline>
+        </w:drawing>
+      </w:r>
+      <w:r>
+        <w:rPr>
+          <w:rFonts w:hint="default" w:eastAsiaTheme="minorEastAsia"/>
+          <w:sz w:val="24"/>
+          <w:szCs w:val="24"/>
+          <w:lang w:val="en-US" w:eastAsia="zh-CN"/>
+        </w:rPr>
+        <w:br w:type="textWrapping"/>
+      </w:r>
+      <w:r>
+        <w:rPr>
+          <w:rFonts w:hint="default" w:eastAsiaTheme="minorEastAsia"/>
+          <w:sz w:val="24"/>
+          <w:szCs w:val="24"/>
+          <w:lang w:val="en-US" w:eastAsia="zh-CN"/>
+        </w:rPr>
+        <w:drawing>
+          <wp:inline distT="0" distB="0" distL="114300" distR="114300">
+            <wp:extent cx="5266690" cy="2962275"/>
+            <wp:effectExtent l="0" t="0" r="10160" b="9525"/>
+            <wp:docPr id="4" name="图片 4" descr="3fe17ab32bad65bd56b8a32128e0b46b"/>
+            <wp:cNvGraphicFramePr>
+              <a:graphicFrameLocks xmlns:a="http://schemas.openxmlformats.org/drawingml/2006/main" noChangeAspect="1"/>
+            </wp:cNvGraphicFramePr>
+            <a:graphic xmlns:a="http://schemas.openxmlformats.org/drawingml/2006/main">
+              <a:graphicData uri="http://schemas.openxmlformats.org/drawingml/2006/picture">
+                <pic:pic xmlns:pic="http://schemas.openxmlformats.org/drawingml/2006/picture">
+                  <pic:nvPicPr>
+                    <pic:cNvPr id="4" name="图片 4" descr="3fe17ab32bad65bd56b8a32128e0b46b"/>
+                    <pic:cNvPicPr>
+                      <a:picLocks noChangeAspect="1"/>
+                    </pic:cNvPicPr>
+                  </pic:nvPicPr>
+                  <pic:blipFill>
+                    <a:blip r:embed="rId7"/>
+                    <a:stretch>
+                      <a:fillRect/>
+                    </a:stretch>
+                  </pic:blipFill>
+                  <pic:spPr>
+                    <a:xfrm>
+                      <a:off x="0" y="0"/>
+                      <a:ext cx="5266690" cy="2962275"/>
+                    </a:xfrm>
+                    <a:prstGeom prst="rect">
+                      <a:avLst/>
+                    </a:prstGeom>
+                  </pic:spPr>
+                </pic:pic>
+              </a:graphicData>
+            </a:graphic>
+          </wp:inline>
+        </w:drawing>
+      </w:r>
+      <w:r>
+        <w:rPr>
+          <w:rFonts w:hint="default" w:eastAsiaTheme="minorEastAsia"/>
+          <w:sz w:val="24"/>
+          <w:szCs w:val="24"/>
+          <w:lang w:val="en-US" w:eastAsia="zh-CN"/>
+        </w:rPr>
+        <w:br w:type="textWrapping"/>
+      </w:r>
+      <w:r>
+        <w:rPr>
+          <w:rFonts w:hint="default" w:eastAsiaTheme="minorEastAsia"/>
+          <w:sz w:val="24"/>
+          <w:szCs w:val="24"/>
+          <w:lang w:val="en-US" w:eastAsia="zh-CN"/>
+        </w:rPr>
+        <w:drawing>
+          <wp:inline distT="0" distB="0" distL="114300" distR="114300">
+            <wp:extent cx="5266690" cy="2962275"/>
+            <wp:effectExtent l="0" t="0" r="10160" b="9525"/>
+            <wp:docPr id="5" name="图片 5" descr="ad3f9fcf4c8ee4c2d2535b3b3ef5fe66"/>
+            <wp:cNvGraphicFramePr>
+              <a:graphicFrameLocks xmlns:a="http://schemas.openxmlformats.org/drawingml/2006/main" noChangeAspect="1"/>
+            </wp:cNvGraphicFramePr>
+            <a:graphic xmlns:a="http://schemas.openxmlformats.org/drawingml/2006/main">
+              <a:graphicData uri="http://schemas.openxmlformats.org/drawingml/2006/picture">
+                <pic:pic xmlns:pic="http://schemas.openxmlformats.org/drawingml/2006/picture">
+                  <pic:nvPicPr>
+                    <pic:cNvPr id="5" name="图片 5" descr="ad3f9fcf4c8ee4c2d2535b3b3ef5fe66"/>
+                    <pic:cNvPicPr>
+                      <a:picLocks noChangeAspect="1"/>
+                    </pic:cNvPicPr>
+                  </pic:nvPicPr>
+                  <pic:blipFill>
+                    <a:blip r:embed="rId8"/>
+                    <a:stretch>
+                      <a:fillRect/>
+                    </a:stretch>
+                  </pic:blipFill>
+                  <pic:spPr>
+                    <a:xfrm>
+                      <a:off x="0" y="0"/>
+                      <a:ext cx="5266690" cy="2962275"/>
+                    </a:xfrm>
+                    <a:prstGeom prst="rect">
+                      <a:avLst/>
+                    </a:prstGeom>
+                  </pic:spPr>
+                </pic:pic>
+              </a:graphicData>
+            </a:graphic>
+          </wp:inline>
+        </w:drawing>
+      </w:r>
     </w:p>
     <w:p>
       <w:pPr>
         <w:rPr>
-          <w:rFonts w:hint="eastAsia" w:eastAsiaTheme="minorEastAsia"/>
-          <w:sz w:val="24"/>
-          <w:szCs w:val="24"/>
-          <w:lang w:eastAsia="zh-CN"/>
-        </w:rPr>
-      </w:pPr>
-      <w:r>
-        <w:rPr>
-          <w:rFonts w:hint="eastAsia"/>
-          <w:sz w:val="24"/>
-          <w:szCs w:val="24"/>
-          <w:lang w:eastAsia="zh-CN"/>
-        </w:rPr>
-        <w:t>。。。</w:t>
-      </w:r>
+          <w:sz w:val="24"/>
+          <w:szCs w:val="24"/>
+        </w:rPr>
+      </w:pPr>
     </w:p>
     <w:p>
       <w:pPr>
-        <w:rPr>
-          <w:rFonts w:hint="eastAsia"/>
-          <w:sz w:val="24"/>
-          <w:szCs w:val="24"/>
-        </w:rPr>
-      </w:pPr>
-      <w:r>
-        <w:rPr>
-          <w:rFonts w:hint="eastAsia"/>
-          <w:sz w:val="24"/>
-          <w:szCs w:val="24"/>
-        </w:rPr>
-        <w:t>4.2</w:t>
-      </w:r>
-      <w:r>
-        <w:rPr>
-          <w:rFonts w:hint="eastAsia"/>
-          <w:sz w:val="24"/>
-          <w:szCs w:val="24"/>
-          <w:lang w:val="en-US" w:eastAsia="zh-CN"/>
-        </w:rPr>
-        <w:t xml:space="preserve"> </w:t>
-      </w:r>
-      <w:r>
-        <w:rPr>
-          <w:rFonts w:hint="eastAsia"/>
-          <w:sz w:val="24"/>
-          <w:szCs w:val="24"/>
-        </w:rPr>
-        <w:t>PacketMonitor</w:t>
+        <w:numPr>
+          <w:ilvl w:val="0"/>
+          <w:numId w:val="2"/>
+        </w:numPr>
+        <w:rPr>
+          <w:rFonts w:hint="eastAsia" w:eastAsiaTheme="minorEastAsia"/>
+          <w:sz w:val="24"/>
+          <w:szCs w:val="24"/>
+          <w:lang w:val="en-US" w:eastAsia="zh-CN"/>
+        </w:rPr>
+      </w:pPr>
+      <w:r>
+        <w:rPr>
+          <w:rFonts w:hint="eastAsia"/>
+          <w:sz w:val="24"/>
+          <w:szCs w:val="24"/>
+          <w:lang w:val="en-US" w:eastAsia="zh-CN"/>
+        </w:rPr>
+        <w:t>运行</w:t>
+      </w:r>
+      <w:r>
+        <w:rPr>
+          <w:rFonts w:hint="eastAsia"/>
+          <w:sz w:val="24"/>
+          <w:szCs w:val="24"/>
+          <w:lang w:val="en-US" w:eastAsia="zh-CN"/>
+        </w:rPr>
+        <w:br w:type="textWrapping"/>
+      </w:r>
+      <w:r>
+        <w:rPr>
+          <w:rFonts w:hint="eastAsia" w:eastAsiaTheme="minorEastAsia"/>
+          <w:sz w:val="24"/>
+          <w:szCs w:val="24"/>
+          <w:lang w:val="en-US" w:eastAsia="zh-CN"/>
+        </w:rPr>
+        <w:drawing>
+          <wp:inline distT="0" distB="0" distL="114300" distR="114300">
+            <wp:extent cx="5268595" cy="2962910"/>
+            <wp:effectExtent l="0" t="0" r="8255" b="8890"/>
+            <wp:docPr id="6" name="图片 6" descr="71071ae8908d21deb3280fa027d27551"/>
+            <wp:cNvGraphicFramePr>
+              <a:graphicFrameLocks xmlns:a="http://schemas.openxmlformats.org/drawingml/2006/main" noChangeAspect="1"/>
+            </wp:cNvGraphicFramePr>
+            <a:graphic xmlns:a="http://schemas.openxmlformats.org/drawingml/2006/main">
+              <a:graphicData uri="http://schemas.openxmlformats.org/drawingml/2006/picture">
+                <pic:pic xmlns:pic="http://schemas.openxmlformats.org/drawingml/2006/picture">
+                  <pic:nvPicPr>
+                    <pic:cNvPr id="6" name="图片 6" descr="71071ae8908d21deb3280fa027d27551"/>
+                    <pic:cNvPicPr>
+                      <a:picLocks noChangeAspect="1"/>
+                    </pic:cNvPicPr>
+                  </pic:nvPicPr>
+                  <pic:blipFill>
+                    <a:blip r:embed="rId9"/>
+                    <a:stretch>
+                      <a:fillRect/>
+                    </a:stretch>
+                  </pic:blipFill>
+                  <pic:spPr>
+                    <a:xfrm>
+                      <a:off x="0" y="0"/>
+                      <a:ext cx="5268595" cy="2962910"/>
+                    </a:xfrm>
+                    <a:prstGeom prst="rect">
+                      <a:avLst/>
+                    </a:prstGeom>
+                  </pic:spPr>
+                </pic:pic>
+              </a:graphicData>
+            </a:graphic>
+          </wp:inline>
+        </w:drawing>
+      </w:r>
+      <w:r>
+        <w:rPr>
+          <w:rFonts w:hint="eastAsia" w:eastAsiaTheme="minorEastAsia"/>
+          <w:sz w:val="24"/>
+          <w:szCs w:val="24"/>
+          <w:lang w:val="en-US" w:eastAsia="zh-CN"/>
+        </w:rPr>
+        <w:drawing>
+          <wp:inline distT="0" distB="0" distL="114300" distR="114300">
+            <wp:extent cx="5268595" cy="2962910"/>
+            <wp:effectExtent l="0" t="0" r="8255" b="8890"/>
+            <wp:docPr id="7" name="图片 7" descr="0227725f8cce60fa64df8679f1b91436"/>
+            <wp:cNvGraphicFramePr>
+              <a:graphicFrameLocks xmlns:a="http://schemas.openxmlformats.org/drawingml/2006/main" noChangeAspect="1"/>
+            </wp:cNvGraphicFramePr>
+            <a:graphic xmlns:a="http://schemas.openxmlformats.org/drawingml/2006/main">
+              <a:graphicData uri="http://schemas.openxmlformats.org/drawingml/2006/picture">
+                <pic:pic xmlns:pic="http://schemas.openxmlformats.org/drawingml/2006/picture">
+                  <pic:nvPicPr>
+                    <pic:cNvPr id="7" name="图片 7" descr="0227725f8cce60fa64df8679f1b91436"/>
+                    <pic:cNvPicPr>
+                      <a:picLocks noChangeAspect="1"/>
+                    </pic:cNvPicPr>
+                  </pic:nvPicPr>
+                  <pic:blipFill>
+                    <a:blip r:embed="rId10"/>
+                    <a:stretch>
+                      <a:fillRect/>
+                    </a:stretch>
+                  </pic:blipFill>
+                  <pic:spPr>
+                    <a:xfrm>
+                      <a:off x="0" y="0"/>
+                      <a:ext cx="5268595" cy="2962910"/>
+                    </a:xfrm>
+                    <a:prstGeom prst="rect">
+                      <a:avLst/>
+                    </a:prstGeom>
+                  </pic:spPr>
+                </pic:pic>
+              </a:graphicData>
+            </a:graphic>
+          </wp:inline>
+        </w:drawing>
       </w:r>
     </w:p>
     <w:p>
       <w:pPr>
         <w:rPr>
-          <w:rFonts w:hint="default" w:eastAsiaTheme="minorEastAsia"/>
-          <w:sz w:val="24"/>
-          <w:szCs w:val="24"/>
-          <w:lang w:val="en-US" w:eastAsia="zh-CN"/>
-        </w:rPr>
-      </w:pPr>
-      <w:r>
-        <w:rPr>
-          <w:rFonts w:hint="eastAsia"/>
-          <w:sz w:val="24"/>
-          <w:szCs w:val="24"/>
-        </w:rPr>
-        <w:t>1.</w:t>
-      </w:r>
-      <w:r>
-        <w:rPr>
-          <w:rFonts w:hint="eastAsia"/>
-          <w:sz w:val="24"/>
-          <w:szCs w:val="24"/>
-          <w:lang w:val="en-US" w:eastAsia="zh-CN"/>
-        </w:rPr>
-        <w:t>步骤xxx</w:t>
-      </w:r>
+          <w:sz w:val="24"/>
+          <w:szCs w:val="24"/>
+        </w:rPr>
+      </w:pPr>
     </w:p>
     <w:p>
       <w:pPr>
-        <w:rPr>
-          <w:sz w:val="24"/>
-          <w:szCs w:val="24"/>
-        </w:rPr>
-      </w:pPr>
-    </w:p>
-    <w:p>
-      <w:pPr>
-        <w:rPr>
-          <w:sz w:val="24"/>
-          <w:szCs w:val="24"/>
-        </w:rPr>
-      </w:pPr>
-      <w:r>
-        <w:rPr>
-          <w:sz w:val="24"/>
-          <w:szCs w:val="24"/>
-        </w:rPr>
-        <w:t>2</w:t>
-      </w:r>
-      <w:r>
-        <w:rPr>
-          <w:rFonts w:hint="eastAsia"/>
-          <w:sz w:val="24"/>
-          <w:szCs w:val="24"/>
-        </w:rPr>
-        <w:t>.</w:t>
-      </w:r>
-    </w:p>
-    <w:p>
-      <w:pPr>
-        <w:rPr>
-          <w:sz w:val="24"/>
-          <w:szCs w:val="24"/>
-        </w:rPr>
-      </w:pPr>
-    </w:p>
-    <w:p>
-      <w:pPr>
-        <w:rPr>
-          <w:rFonts w:hint="eastAsia"/>
-          <w:sz w:val="24"/>
-          <w:szCs w:val="24"/>
-        </w:rPr>
-      </w:pPr>
-      <w:r>
-        <w:rPr>
-          <w:rFonts w:hint="eastAsia"/>
-          <w:sz w:val="24"/>
-          <w:szCs w:val="24"/>
-        </w:rPr>
-        <w:t>3.</w:t>
+        <w:numPr>
+          <w:ilvl w:val="0"/>
+          <w:numId w:val="2"/>
+        </w:numPr>
+        <w:ind w:left="0" w:leftChars="0" w:firstLine="0" w:firstLineChars="0"/>
+        <w:rPr>
+          <w:rFonts w:hint="eastAsia" w:eastAsiaTheme="minorEastAsia"/>
+          <w:sz w:val="24"/>
+          <w:szCs w:val="24"/>
+          <w:lang w:val="en-US" w:eastAsia="zh-CN"/>
+        </w:rPr>
+      </w:pPr>
+      <w:r>
+        <w:rPr>
+          <w:rFonts w:hint="eastAsia"/>
+          <w:sz w:val="24"/>
+          <w:szCs w:val="24"/>
+          <w:lang w:val="en-US" w:eastAsia="zh-CN"/>
+        </w:rPr>
+        <w:t>查看结果</w:t>
+      </w:r>
+      <w:r>
+        <w:rPr>
+          <w:rFonts w:hint="eastAsia"/>
+          <w:sz w:val="24"/>
+          <w:szCs w:val="24"/>
+          <w:lang w:val="en-US" w:eastAsia="zh-CN"/>
+        </w:rPr>
+        <w:br w:type="textWrapping"/>
+      </w:r>
+      <w:r>
+        <w:rPr>
+          <w:rFonts w:hint="eastAsia" w:eastAsiaTheme="minorEastAsia"/>
+          <w:sz w:val="24"/>
+          <w:szCs w:val="24"/>
+          <w:lang w:val="en-US" w:eastAsia="zh-CN"/>
+        </w:rPr>
+        <w:drawing>
+          <wp:inline distT="0" distB="0" distL="114300" distR="114300">
+            <wp:extent cx="5266690" cy="2956560"/>
+            <wp:effectExtent l="0" t="0" r="10160" b="15240"/>
+            <wp:docPr id="8" name="图片 8" descr="b4109571a3a6480c8c64d96b5fcbb607"/>
+            <wp:cNvGraphicFramePr>
+              <a:graphicFrameLocks xmlns:a="http://schemas.openxmlformats.org/drawingml/2006/main" noChangeAspect="1"/>
+            </wp:cNvGraphicFramePr>
+            <a:graphic xmlns:a="http://schemas.openxmlformats.org/drawingml/2006/main">
+              <a:graphicData uri="http://schemas.openxmlformats.org/drawingml/2006/picture">
+                <pic:pic xmlns:pic="http://schemas.openxmlformats.org/drawingml/2006/picture">
+                  <pic:nvPicPr>
+                    <pic:cNvPr id="8" name="图片 8" descr="b4109571a3a6480c8c64d96b5fcbb607"/>
+                    <pic:cNvPicPr>
+                      <a:picLocks noChangeAspect="1"/>
+                    </pic:cNvPicPr>
+                  </pic:nvPicPr>
+                  <pic:blipFill>
+                    <a:blip r:embed="rId11"/>
+                    <a:stretch>
+                      <a:fillRect/>
+                    </a:stretch>
+                  </pic:blipFill>
+                  <pic:spPr>
+                    <a:xfrm>
+                      <a:off x="0" y="0"/>
+                      <a:ext cx="5266690" cy="2956560"/>
+                    </a:xfrm>
+                    <a:prstGeom prst="rect">
+                      <a:avLst/>
+                    </a:prstGeom>
+                  </pic:spPr>
+                </pic:pic>
+              </a:graphicData>
+            </a:graphic>
+          </wp:inline>
+        </w:drawing>
       </w:r>
     </w:p>
     <w:p>
@@ -876,6 +1155,18 @@
 <file path=word/numbering.xml><?xml version="1.0" encoding="utf-8"?>
 <w:numbering xmlns:wpc="http://schemas.microsoft.com/office/word/2010/wordprocessingCanvas" xmlns:mc="http://schemas.openxmlformats.org/markup-compatibility/2006" xmlns:o="urn:schemas-microsoft-com:office:office" xmlns:r="http://schemas.openxmlformats.org/officeDocument/2006/relationships" xmlns:m="http://schemas.openxmlformats.org/officeDocument/2006/math" xmlns:v="urn:schemas-microsoft-com:vml" xmlns:wp14="http://schemas.microsoft.com/office/word/2010/wordprocessingDrawing" xmlns:wp="http://schemas.openxmlformats.org/drawingml/2006/wordprocessingDrawing" xmlns:w10="urn:schemas-microsoft-com:office:word" xmlns:w="http://schemas.openxmlformats.org/wordprocessingml/2006/main" xmlns:w14="http://schemas.microsoft.com/office/word/2010/wordml" xmlns:wpg="http://schemas.microsoft.com/office/word/2010/wordprocessingGroup" xmlns:wpi="http://schemas.microsoft.com/office/word/2010/wordprocessingInk" xmlns:wne="http://schemas.microsoft.com/office/word/2006/wordml" xmlns:wps="http://schemas.microsoft.com/office/word/2010/wordprocessingShape" xmlns:wpsCustomData="http://www.wps.cn/officeDocument/2013/wpsCustomData" mc:Ignorable="w14 wp14">
   <w:abstractNum w:abstractNumId="0">
+    <w:nsid w:val="DE216F03"/>
+    <w:multiLevelType w:val="singleLevel"/>
+    <w:tmpl w:val="DE216F03"/>
+    <w:lvl w:ilvl="0" w:tentative="0">
+      <w:start w:val="2"/>
+      <w:numFmt w:val="decimal"/>
+      <w:suff w:val="space"/>
+      <w:lvlText w:val="%1."/>
+      <w:lvlJc w:val="left"/>
+    </w:lvl>
+  </w:abstractNum>
+  <w:abstractNum w:abstractNumId="1">
     <w:nsid w:val="4D2006F4"/>
     <w:multiLevelType w:val="multilevel"/>
     <w:tmpl w:val="4D2006F4"/>
@@ -1007,6 +1298,9 @@
     </w:lvl>
   </w:abstractNum>
   <w:num w:numId="1">
+    <w:abstractNumId w:val="1"/>
+  </w:num>
+  <w:num w:numId="2">
     <w:abstractNumId w:val="0"/>
   </w:num>
 </w:numbering>

</xml_diff>